<commit_message>
Oficio con el formato del Comité Asesor de Ciencias de la Computación
Los párrafos del borrador usan estilos FCEN copiados del oficio original:
Ancízar 11 pt, interlineado 1,15, casos con sangría francesa y numeración
2.N, la cita del correo dentro del mismo párrafo, asignaturas como
«Nombre código N» y el bloque de firma del original.

Co-Authored-By: Claude Opus 5.5 <noreply@anthropic.com>
Claude-Session: https://claude.ai/code/session_016BHeMciS6mdwN3dB29y63i
</commit_message>
<xml_diff>
--- a/app/templates/oficio_base.docx
+++ b/app/templates/oficio_base.docx
@@ -8814,6 +8814,151 @@
       </w:tblBorders>
     </w:tblPr>
   </w:style>
+  <w:style w:type="paragraph" w:customStyle="1" w:styleId="FCENFecha">
+    <w:name w:val="FCEN Fecha"/>
+    <w:basedOn w:val="Normal"/>
+    <w:qFormat/>
+    <w:pPr>
+      <w:tabs>
+        <w:tab w:val="left" w:pos="142"/>
+        <w:tab w:val="right" w:pos="8647"/>
+      </w:tabs>
+      <w:spacing w:after="0" w:line="276" w:lineRule="auto"/>
+      <w:jc w:val="both"/>
+    </w:pPr>
+    <w:rPr/>
+  </w:style>
+  <w:style w:type="paragraph" w:customStyle="1" w:styleId="FCENDestinatario">
+    <w:name w:val="FCEN Destinatario"/>
+    <w:basedOn w:val="Normal"/>
+    <w:qFormat/>
+    <w:pPr>
+      <w:spacing w:after="0"/>
+      <w:jc w:val="left"/>
+    </w:pPr>
+    <w:rPr/>
+  </w:style>
+  <w:style w:type="paragraph" w:customStyle="1" w:styleId="FCENTexto">
+    <w:name w:val="FCEN Texto"/>
+    <w:basedOn w:val="Normal"/>
+    <w:qFormat/>
+    <w:pPr>
+      <w:spacing w:after="0" w:line="276" w:lineRule="auto"/>
+      <w:jc w:val="both"/>
+    </w:pPr>
+    <w:rPr>
+      <w:sz w:val="20"/>
+      <w:szCs w:val="20"/>
+    </w:rPr>
+  </w:style>
+  <w:style w:type="paragraph" w:customStyle="1" w:styleId="FCENTitulo">
+    <w:name w:val="FCEN Titulo"/>
+    <w:basedOn w:val="Normal"/>
+    <w:qFormat/>
+    <w:pPr>
+      <w:keepNext/>
+      <w:spacing w:line="276" w:lineRule="auto"/>
+      <w:jc w:val="left"/>
+    </w:pPr>
+    <w:rPr>
+      <w:b/>
+      <w:u w:val="single"/>
+    </w:rPr>
+  </w:style>
+  <w:style w:type="paragraph" w:customStyle="1" w:styleId="FCENCaso">
+    <w:name w:val="FCEN Caso"/>
+    <w:basedOn w:val="Normal"/>
+    <w:qFormat/>
+    <w:pPr>
+      <w:spacing w:line="276" w:lineRule="auto"/>
+      <w:ind w:left="993" w:hanging="284"/>
+      <w:jc w:val="both"/>
+    </w:pPr>
+    <w:rPr/>
+  </w:style>
+  <w:style w:type="paragraph" w:customStyle="1" w:styleId="FCENCita">
+    <w:name w:val="FCEN Cita"/>
+    <w:basedOn w:val="Normal"/>
+    <w:qFormat/>
+    <w:pPr>
+      <w:spacing w:line="276" w:lineRule="auto"/>
+      <w:ind w:left="993"/>
+      <w:jc w:val="both"/>
+    </w:pPr>
+    <w:rPr>
+      <w:i/>
+    </w:rPr>
+  </w:style>
+  <w:style w:type="paragraph" w:customStyle="1" w:styleId="FCENCuerpo">
+    <w:name w:val="FCEN Cuerpo"/>
+    <w:basedOn w:val="Normal"/>
+    <w:qFormat/>
+    <w:pPr>
+      <w:spacing w:line="276" w:lineRule="auto"/>
+      <w:jc w:val="both"/>
+    </w:pPr>
+    <w:rPr/>
+  </w:style>
+  <w:style w:type="paragraph" w:customStyle="1" w:styleId="FCENRotulo">
+    <w:name w:val="FCEN Rotulo"/>
+    <w:basedOn w:val="Normal"/>
+    <w:qFormat/>
+    <w:pPr>
+      <w:keepNext/>
+      <w:spacing w:after="60" w:line="276" w:lineRule="auto"/>
+      <w:ind w:left="993"/>
+      <w:jc w:val="left"/>
+    </w:pPr>
+    <w:rPr>
+      <w:b/>
+    </w:rPr>
+  </w:style>
+  <w:style w:type="paragraph" w:customStyle="1" w:styleId="FCENVineta">
+    <w:name w:val="FCEN Vineta"/>
+    <w:basedOn w:val="Normal"/>
+    <w:qFormat/>
+    <w:pPr>
+      <w:spacing w:after="0" w:line="276" w:lineRule="auto"/>
+      <w:ind w:left="1418" w:hanging="284"/>
+      <w:jc w:val="both"/>
+    </w:pPr>
+    <w:rPr/>
+  </w:style>
+  <w:style w:type="paragraph" w:customStyle="1" w:styleId="FCENNorma">
+    <w:name w:val="FCEN Norma"/>
+    <w:basedOn w:val="Normal"/>
+    <w:qFormat/>
+    <w:pPr>
+      <w:spacing w:after="60" w:line="240" w:lineRule="auto"/>
+      <w:ind w:left="993"/>
+      <w:jc w:val="both"/>
+    </w:pPr>
+    <w:rPr>
+      <w:i/>
+      <w:sz w:val="20"/>
+      <w:szCs w:val="20"/>
+    </w:rPr>
+  </w:style>
+  <w:style w:type="paragraph" w:customStyle="1" w:styleId="FCENImagen">
+    <w:name w:val="FCEN Imagen"/>
+    <w:basedOn w:val="Normal"/>
+    <w:qFormat/>
+    <w:pPr>
+      <w:spacing w:after="200"/>
+      <w:jc w:val="center"/>
+    </w:pPr>
+    <w:rPr/>
+  </w:style>
+  <w:style w:type="paragraph" w:customStyle="1" w:styleId="FCENFirma">
+    <w:name w:val="FCEN Firma"/>
+    <w:basedOn w:val="Normal"/>
+    <w:qFormat/>
+    <w:pPr>
+      <w:spacing w:after="0"/>
+      <w:jc w:val="left"/>
+    </w:pPr>
+    <w:rPr/>
+  </w:style>
 </w:styles>
 </file>
 

</xml_diff>

<commit_message>
fix: logo del encabezado en línea arriba a la derecha y el nombre debajo
Co-Authored-By: Claude Sonnet 5.5 <noreply@anthropic.com>
</commit_message>
<xml_diff>
--- a/app/templates/oficio_base.docx
+++ b/app/templates/oficio_base.docx
@@ -1841,64 +1841,19 @@
     <w:pPr>
       <w:spacing w:after="0"/>
       <w:jc w:val="right"/>
-      <w:rPr>
-        <w:i/>
-        <w:iCs/>
-        <w:color w:val="000000"/>
-        <w:sz w:val="14"/>
-        <w:szCs w:val="14"/>
-      </w:rPr>
     </w:pPr>
     <w:r>
-      <w:tab/>
-    </w:r>
-    <w:r>
-      <w:tab/>
-      <w:t xml:space="preserve"> </w:t>
-    </w:r>
-    <w:r>
-      <w:tab/>
-    </w:r>
-    <w:r>
-      <w:tab/>
-    </w:r>
-    <w:r>
-      <w:tab/>
-    </w:r>
-    <w:r>
-      <w:rPr>
-        <w:i/>
-        <w:iCs/>
-        <w:color w:val="000000"/>
-        <w:sz w:val="14"/>
-        <w:szCs w:val="14"/>
-      </w:rPr>
-      <w:t>{{ENCABEZADO}}</w:t>
-    </w:r>
-    <w:r>
-      <w:rPr>
-        <w:noProof/>
-      </w:rPr>
-      <w:drawing>
-        <wp:anchor distT="0" distB="0" distL="114300" distR="114300" simplePos="0" relativeHeight="251660288" behindDoc="0" locked="0" layoutInCell="1" hidden="0" allowOverlap="1" wp14:anchorId="5A685362" wp14:editId="6F53C99D">
-          <wp:simplePos x="0" y="0"/>
-          <wp:positionH relativeFrom="column">
-            <wp:posOffset>4781550</wp:posOffset>
-          </wp:positionH>
-          <wp:positionV relativeFrom="paragraph">
-            <wp:posOffset>-266699</wp:posOffset>
-          </wp:positionV>
-          <wp:extent cx="1638300" cy="864870"/>
-          <wp:effectExtent l="0" t="0" r="0" b="0"/>
-          <wp:wrapSquare wrapText="bothSides" distT="0" distB="0" distL="114300" distR="114300"/>
-          <wp:docPr id="22" name="image1.jpg" descr="D:\BORRADOR DIRECTRICES\GUIA DE ELEMENTOS DE IDENTIDAD VISUAL\SISTEMA DE IDENTIFIACIÓN DE DEPENDENCIAS\LOGOSIMBOLO PARA RECTORIA\JPG_LOGOSÍMBOLO RECTORIA-07.jpg"/>
+      <w:drawing xmlns:a="http://schemas.openxmlformats.org/drawingml/2006/main" xmlns:pic="http://schemas.openxmlformats.org/drawingml/2006/picture">
+        <wp:inline distT="0" distB="0" distL="0" distR="0">
+          <wp:extent cx="1400000" cy="735700"/>
+          <wp:docPr id="22" name="Logo" descr="Universidad Nacional de Colombia"/>
           <wp:cNvGraphicFramePr/>
-          <a:graphic xmlns:a="http://schemas.openxmlformats.org/drawingml/2006/main">
+          <a:graphic>
             <a:graphicData uri="http://schemas.openxmlformats.org/drawingml/2006/picture">
-              <pic:pic xmlns:pic="http://schemas.openxmlformats.org/drawingml/2006/picture">
+              <pic:pic>
                 <pic:nvPicPr>
-                  <pic:cNvPr id="0" name="image1.jpg" descr="D:\BORRADOR DIRECTRICES\GUIA DE ELEMENTOS DE IDENTIDAD VISUAL\SISTEMA DE IDENTIFIACIÓN DE DEPENDENCIAS\LOGOSIMBOLO PARA RECTORIA\JPG_LOGOSÍMBOLO RECTORIA-07.jpg"/>
-                  <pic:cNvPicPr preferRelativeResize="0"/>
+                  <pic:cNvPr id="0" name="logo.jpg"/>
+                  <pic:cNvPicPr/>
                 </pic:nvPicPr>
                 <pic:blipFill>
                   <a:blip r:embed="rId1"/>
@@ -1910,18 +1865,43 @@
                 <pic:spPr>
                   <a:xfrm>
                     <a:off x="0" y="0"/>
-                    <a:ext cx="1638300" cy="864870"/>
+                    <a:ext cx="1400000" cy="735700"/>
                   </a:xfrm>
                   <a:prstGeom prst="rect">
                     <a:avLst/>
                   </a:prstGeom>
-                  <a:ln/>
                 </pic:spPr>
               </pic:pic>
             </a:graphicData>
           </a:graphic>
-        </wp:anchor>
+        </wp:inline>
       </w:drawing>
+    </w:r>
+  </w:p>
+  <w:p>
+    <w:pPr>
+      <w:spacing w:after="0"/>
+      <w:jc w:val="right"/>
+      <w:rPr>
+        <w:i/>
+        <w:iCs/>
+        <w:color w:val="000000"/>
+        <w:sz w:val="14"/>
+        <w:szCs w:val="14"/>
+      </w:rPr>
+    </w:pPr>
+    <w:r>
+      <w:t xml:space="preserve"> </w:t>
+    </w:r>
+    <w:r>
+      <w:rPr>
+        <w:i/>
+        <w:iCs/>
+        <w:color w:val="000000"/>
+        <w:sz w:val="14"/>
+        <w:szCs w:val="14"/>
+      </w:rPr>
+      <w:t>{{ENCABEZADO}}</w:t>
     </w:r>
   </w:p>
   <w:p>

</xml_diff>